<commit_message>
Set 5 report: trim to ~2.55-2.6k words and add a 14th figure
- Compress the prose so the total lands around 2550-2600 words while
  keeping every result number, both duck discussions, the architecture
  rationale and the analysis.
- Add Figure 12 (QuickDraw samples across training epochs), directly
  covering the 2.3 'visual outputs across epochs' requirement -> 14
  figures total.
- Add an explicit generalisation-across-attack-types sentence for 2.2.
- Rebuild the .docx (14 images embedded, valid OOXML).
</commit_message>
<xml_diff>
--- a/Set 5/GAN_Assignment_Set5_Report.docx
+++ b/Set 5/GAN_Assignment_Set5_Report.docx
@@ -20,12 +20,7 @@
     </w:p>
     <w:p>
       <w:r>
-        <w:t xml:space="preserve">This report accompanies the submitted notebook and documents the design decisions, training behaviour and results of a set of generative adversarial networks (GANs). A GAN pits a generator against a discriminator in a minimax game, and at the point where the discriminator can no longer separate real from synthetic samples the generator has, in effect, learned the data distribution (Goodfellow et al., 2014). Part 1 builds this machinery from scratch on controllable 2D data so the mechanics stay visible; Part 2 then applies GANs to three contrasting real-world problems — medical imaging, network security and creative sketching — each of which stresses a different aspect of generative modelling.</w:t>
-      </w:r>
-    </w:p>
-    <w:p>
-      <w:r>
-        <w:t xml:space="preserve">A single framework was not imposed everywhere. The from-scratch 2D models and the tabular traffic model are written in PyTorch, while the two image problems use TensorFlow/Keras, where the convolutional and conditional components were quicker to assemble. All random seeds are fixed before execution so every figure and metric below is reproducible.</w:t>
+        <w:t xml:space="preserve">A generative adversarial network (GAN) trains a generator against a discriminator; at the equilibrium where the discriminator can no longer separate real from synthetic samples, the generator has effectively learned the data distribution (Goodfellow et al., 2014). Part 1 builds this machinery from scratch on controllable 2D data so the mechanics stay visible, and Part 2 applies GANs to three contrasting problems — medical imaging, network security and creative sketching — each stressing a different aspect of generative modelling. PyTorch was used for the 2D models and the tabular traffic model, and TensorFlow/Keras for the two image problems; all seeds are fixed so every result below is reproducible.</w:t>
       </w:r>
     </w:p>
     <w:p>
@@ -38,7 +33,7 @@
     </w:p>
     <w:p>
       <w:r>
-        <w:t xml:space="preserve">Part 1 was implemented directly in PyTorch without a GAN library, wrapping the generator and critic in one reusable class. The generator is a multilayer perceptron regularised with Layer Normalisation (Ba, Kiros &amp; Hinton, 2016), and the critic is constrained with spectral normalisation (Miyato et al., 2018) so it cannot overwhelm the generator early in training. Both optimise the non-saturating binary cross-entropy loss with one-sided label smoothing (Salimans et al., 2016) using Adam (Kingma &amp; Ba, 2015). This configuration was chosen deliberately: on tiny 2D problems an unconstrained critic tends to win immediately, and spectral normalisation is the cheapest principled way to keep the two networks balanced.</w:t>
+        <w:t xml:space="preserve">Part 1 was implemented directly in PyTorch. The generator is an MLP regularised with Layer Normalisation (Ba, Kiros &amp; Hinton, 2016) and the critic is constrained with spectral normalisation (Miyato et al., 2018), which was chosen because on tiny 2D problems an unconstrained critic wins almost immediately; spectral normalisation is the cheapest principled way to keep the two networks balanced. Both optimise the non-saturating loss with one-sided label smoothing (Salimans et al., 2016) using Adam (Kingma &amp; Ba, 2015).</w:t>
       </w:r>
     </w:p>
     <w:p>
@@ -47,20 +42,6 @@
       </w:pPr>
       <w:r>
         <w:t xml:space="preserve">Task 1 — Reproducing the sine-wave GAN</w:t>
-      </w:r>
-    </w:p>
-    <w:p>
-      <w:r>
-        <w:t xml:space="preserve">The first task reproduces the tutorial sine-wave GAN, sampling points from </w:t>
-      </w:r>
-      <w:r>
-        <w:rPr>
-          <w:i/>
-        </w:rPr>
-        <w:t xml:space="preserve">y = sin(x)</w:t>
-      </w:r>
-      <w:r>
-        <w:t xml:space="preserve"> and asking the generator to match them.</w:t>
       </w:r>
     </w:p>
     <w:p>
@@ -111,7 +92,7 @@
     </w:p>
     <w:p>
       <w:r>
-        <w:t xml:space="preserve">Figure 1 shows the generated points falling along the sine curve rather than scattering, confirming the generator has captured a one-dimensional manifold embedded in 2D. The training log supports this: the critic loss settles near 1.37 and the generator near 0.80 and both stay there without diverging. A critic loss close to 1.37 is meaningful — it is approximately 2·ln2, the value reached when the critic can no longer distinguish the two distributions — so the flatness is a sign of a healthy equilibrium rather than a stalled optimiser (Goodfellow et al., 2014).</w:t>
+        <w:t xml:space="preserve">Figure 1 shows the generated points falling along the sine curve, confirming the generator has captured a 1D manifold embedded in 2D. The critic loss settles near 1.37 and the generator near 0.80 and both hold there. A critic near 1.37 (≈ 2·ln2) is exactly the value reached when it can no longer separate the distributions, so the flatness signals a healthy equilibrium rather than a stalled optimiser (Goodfellow et al., 2014). The one-sided label smoothing contributes directly to this: capping the real target at 0.9 stops the critic pushing its logits to extremes, which keeps a usable gradient flowing to the generator and explains why the curves stay so flat rather than oscillating violently.</w:t>
       </w:r>
     </w:p>
     <w:p>
@@ -124,7 +105,7 @@
     </w:p>
     <w:p>
       <w:r>
-        <w:t xml:space="preserve">For the second task a mixture of eight Gaussians arranged in a ring was chosen over the spiral or noisy curve, because a set of disconnected modes is the classic stress test for mode collapse.</w:t>
+        <w:t xml:space="preserve">A ring of eight Gaussians was chosen over the spiral or noisy curve because a set of disconnected modes is the classic stress test for mode collapse.</w:t>
       </w:r>
     </w:p>
     <w:p>
@@ -175,7 +156,7 @@
     </w:p>
     <w:p>
       <w:r>
-        <w:t xml:space="preserve">Figure 2 demonstrates that the generator reaches all eight modes rather than collapsing onto one or two, which is the main success criterion for this target. The losses hold at essentially the same levels as the sine case (critic ≈ 1.37, generator ≈ 0.80), showing the setup is stable even on a harder, multi-modal target. Closer inspection shows the clusters are not perfectly balanced — some modes are denser than others — a mild form of the mode-imbalance GANs are known to exhibit on multi-modal data (Salimans et al., 2016). The thin scatter of points between modes is not a defect: a continuous generator mapping a connected latent space onto disconnected blobs must pass through the empty space between them, so some bridging points are unavoidable.</w:t>
+        <w:t xml:space="preserve">Figure 2 shows the generator reaching all eight modes rather than collapsing onto one or two, which is the success criterion here. Losses hold at the same levels as the sine case (critic ≈ 1.37, generator ≈ 0.80), so the setup is stable even on a multi-modal target. The clusters are not perfectly balanced — a mild form of mode-imbalance (Salimans et al., 2016) — and the faint scatter between modes is unavoidable, since a continuous generator must pass through the empty space separating disconnected blobs. Reaching all eight modes is the meaningful result here — the standard failure on this target is collapse onto a single blob — and the spectral-normalised critic is largely what prevents it, since a Lipschitz-bounded critic cannot hand the generator the sharp shortcut that usually triggers collapse.</w:t>
       </w:r>
     </w:p>
     <w:p>
@@ -188,7 +169,7 @@
     </w:p>
     <w:p>
       <w:r>
-        <w:t xml:space="preserve">The third task isolates the effect of architecture by holding the Gaussian-ring target fixed and swapping only the generator: a two-layer LeakyReLU baseline against a three-layer GELU version, trained on an identical budget.</w:t>
+        <w:t xml:space="preserve">The third task holds the target fixed and swaps only the generator: a two-layer LeakyReLU baseline versus a three-layer GELU version, on an identical budget.</w:t>
       </w:r>
     </w:p>
     <w:p>
@@ -239,7 +220,7 @@
     </w:p>
     <w:p>
       <w:r>
-        <w:t xml:space="preserve">Figure 3 makes the comparison directly. Numerically the two variants are almost indistinguishable — both finish with a critic near 1.36–1.37 and a generator near 0.80 — so the loss curves alone would suggest no difference. The value of the visual comparison is precisely that it exposes what the metrics hide: the deeper GELU generator produces visibly tighter, better-separated clusters with less inter-mode bridging. The interpretation is that added depth and a smoother activation improve how cleanly the generator carves the latent space into eight regions, even though the adversarial loss has already saturated. This illustrates a wider point that recurs throughout the report — loss values and sample quality are not the same thing, and both must be inspected.</w:t>
+        <w:t xml:space="preserve">Numerically the two variants are almost identical (both critic ≈ 1.36–1.37, generator ≈ 0.80), so the loss curves alone suggest no difference. The value of Figure 3 is that it exposes what the metrics hide: the deeper GELU generator produces visibly tighter, better-separated clusters with less inter-mode bridging. The wider lesson — recurring throughout this report — is that loss values and sample quality are not the same thing, and both must be inspected.</w:t>
       </w:r>
     </w:p>
     <w:p>
@@ -260,7 +241,7 @@
     </w:p>
     <w:p>
       <w:r>
-        <w:t xml:space="preserve">The first application trains a deep convolutional GAN (DCGAN) on the OCTMNIST subset of MedMNIST (Yang et al., 2023). The DCGAN architecture (Radford, Metz &amp; Chintala, 2015) is the natural choice for images because its strided convolutions let the networks learn spatial structure directly. The training split contains 97,477 grayscale scans across four diagnostic classes — choroidal neovascularisation, diabetic macular edema, drusen and normal — rescaled to 32×32 in the range [−1, 1] to match the generator's tanh output.</w:t>
+        <w:t xml:space="preserve">This application trains a deep convolutional GAN (DCGAN) on OCTMNIST (Yang et al., 2023). The DCGAN (Radford, Metz &amp; Chintala, 2015) is the natural choice for images because its strided convolutions learn spatial structure directly. The training split holds 97,477 grayscale scans across four diagnostic classes, rescaled to 32×32 in [−1, 1] to match the generator's tanh output.</w:t>
       </w:r>
     </w:p>
     <w:p>
@@ -311,7 +292,7 @@
     </w:p>
     <w:p>
       <w:r>
-        <w:t xml:space="preserve">Figure 4 shows a clearly imbalanced dataset, which matters later: the classes with the most examples are the ones the conditional model reproduces most convincingly. The generator upsamples a latent vector of size 100 to 32×32 through nearest-neighbour upsampling followed by 3×3 convolutions; transposed convolutions were deliberately avoided because they tend to leave checkerboard artefacts (Odena, Dumoulin &amp; Olah, 2016). The critic is a strided-convolution stack with Batch Normalisation, and training runs for 40 epochs through a shared trainer class.</w:t>
+        <w:t xml:space="preserve">Figure 4 reveals a clearly imbalanced dataset, which matters later: the most frequent classes are the ones the conditional model reproduces best. The generator upsamples a size-100 latent vector to 32×32 with nearest-neighbour upsampling and 3×3 convolutions — transposed convolutions were avoided because they leave checkerboard artefacts (Odena, Dumoulin &amp; Olah, 2016) — and the critic is a strided-convolution stack with Batch Normalisation, trained for 40 epochs.</w:t>
       </w:r>
     </w:p>
     <w:p>
@@ -362,7 +343,7 @@
     </w:p>
     <w:p>
       <w:r>
-        <w:t xml:space="preserve">Figure 5 shows the adversarial game trading off rather than collapsing, with the two losses oscillating within a bounded band across the 40 epochs — the behaviour expected of a stable DCGAN.</w:t>
+        <w:t xml:space="preserve">Figure 5 shows the two losses oscillating within a bounded band across 40 epochs rather than collapsing — the behaviour expected of a stable DCGAN.</w:t>
       </w:r>
     </w:p>
     <w:p>
@@ -413,7 +394,7 @@
     </w:p>
     <w:p>
       <w:r>
-        <w:t xml:space="preserve">Figure 6 is the qualitative comparison, and it is backed quantitatively by a Fréchet Inception Distance (FID) of </w:t>
+        <w:t xml:space="preserve">Figure 6 is backed quantitatively by a Fréchet Inception Distance (FID) of </w:t>
       </w:r>
       <w:r>
         <w:rPr>
@@ -422,7 +403,7 @@
         <w:t xml:space="preserve">32.74</w:t>
       </w:r>
       <w:r>
-        <w:t xml:space="preserve"> (Heusel et al., 2017), the lowest of the three image models in this notebook. The generated scans capture the essential anatomy — a bright, curved retinal band over a darker background — and vary in the band's shape and position, so the generator is not memorising a single template. The main weakness is fine texture: the fakes are slightly too smooth and lose some of the speckle of genuine OCT, which is consistent with the FID being good but not near-zero.</w:t>
+        <w:t xml:space="preserve"> (Heusel et al., 2017), the lowest of the three image models here. The generated scans capture the essential anatomy — a bright, curved retinal band on a dark background — and vary in the band's shape and position, so the generator is not memorising one template. The main weakness is fine texture: the fakes are slightly too smooth, consistent with a good but non-zero FID. This smoothing is the expected signature of an adversarial loss that rewards global plausibility over pixel-level detail, so a higher-capacity generator or an added perceptual-loss term would be the natural levers to recover the missing speckle.</w:t>
       </w:r>
     </w:p>
     <w:p>
@@ -433,7 +414,7 @@
         <w:t xml:space="preserve">Extension — conditional GAN.</w:t>
       </w:r>
       <w:r>
-        <w:t xml:space="preserve"> For extra credit the DCGAN was extended into a conditional GAN (Mirza &amp; Osindero, 2014) so that a class can be requested on demand.</w:t>
+        <w:t xml:space="preserve"> For extra credit the DCGAN was extended into a conditional GAN (Mirza &amp; Osindero, 2014) so a class can be requested on demand.</w:t>
       </w:r>
     </w:p>
     <w:p>
@@ -484,18 +465,18 @@
     </w:p>
     <w:p>
       <w:r>
-        <w:t xml:space="preserve">Figure 7 confirms the conditioning works — each row differs, so the label genuinely steers the output, and the more frequent classes (Figure 4) come out cleanest. This model was also the hardest to stabilise and is worth analysing. A first attempt that fed the label to the critic as a full 32×32 channel gave the critic an overwhelming cue: its loss collapsed while the generator's ran away. The fix combined late-fusion conditioning (the label embedding is only concatenated at the critic's final dense layer), instance noise on the images (Arjovsky &amp; Bottou, 2017), a two-time-scale update rule with a slower critic (Heusel et al., 2017), and two generator steps per critic step. With these changes the losses trade off healthily — the critic drifts from about 1.32 to 0.45 and the generator from about 0.93 to 4.18 over 40 epochs — and the class rows stay distinct.</w:t>
-      </w:r>
-    </w:p>
-    <w:p>
-      <w:r>
-        <w:rPr>
-          <w:b/>
-        </w:rPr>
-        <w:t xml:space="preserve">Reflection and the "duck" discussion.</w:t>
-      </w:r>
-      <w:r>
-        <w:t xml:space="preserve"> The task asks for a reflection on synthetic-data quality, including the "duck" point. The name comes from the duck test: if it looks and quacks like a duck, we call it one. A GAN, even a low-FID one, is only ever trained to pass that surface test. The critic never learns what is </w:t>
+        <w:t xml:space="preserve">Figure 7 confirms conditioning works — each row differs, so the label genuinely steers the output, and the most frequent classes (Figure 4) come out cleanest. This model was also the hardest to stabilise. A first attempt that fed the label to the critic as a full 32×32 channel gave it an overwhelming cue: its loss collapsed while the generator's ran away. The fix combined late-fusion conditioning (the label embedding joins only at the critic's final dense layer), instance noise (Arjovsky &amp; Bottou, 2017), a two-time-scale rule with a slower critic (Heusel et al., 2017), and two generator steps per critic step. The losses then trade off healthily — critic drifting from about 1.32 to 0.45 and generator from about 0.93 to 4.18 over 40 epochs. The broader lesson is that conditioning is less about the generator and more about denying the critic an easy signal: the very label that guides the generator becomes a liability the moment the critic can read it too directly.</w:t>
+      </w:r>
+    </w:p>
+    <w:p>
+      <w:r>
+        <w:rPr>
+          <w:b/>
+        </w:rPr>
+        <w:t xml:space="preserve">The "duck" reflection.</w:t>
+      </w:r>
+      <w:r>
+        <w:t xml:space="preserve"> The duck test — looks and quacks like a duck, so call it one — captures the risk here. A low-FID GAN is only trained to pass that surface test; the critic never learns what is </w:t>
       </w:r>
       <w:r>
         <w:rPr>
@@ -504,7 +485,7 @@
         <w:t xml:space="preserve">medically</w:t>
       </w:r>
       <w:r>
-        <w:t xml:space="preserve"> correct, so a sharp, convincing scan can still contain structure present in no real patient — an invented bright region that reads as pathology, or a genuine feature quietly smoothed away. This is why synthetic scans like these are defensible for augmentation or teaching but must not be trusted for diagnosis: a low FID says the population statistics align, not that any individual image is real.</w:t>
+        <w:t xml:space="preserve"> correct, so a convincing scan can still contain structure present in no real patient. This is why synthetic scans are defensible for augmentation or teaching but not diagnosis: a low FID says the population statistics align, not that any individual image is real.</w:t>
       </w:r>
     </w:p>
     <w:p>
@@ -517,7 +498,7 @@
     </w:p>
     <w:p>
       <w:r>
-        <w:t xml:space="preserve">The second application generates synthetic network-traffic feature vectors from CICIDS 2017 (Sharafaldin, Lashkari &amp; Ghorbani, 2018). Because each flow is described by numeric features rather than pixels, a convolutional model is inappropriate; a fully-connected GAN written in PyTorch was used instead, with a 56-dimensional noise vector. The eight daily CSV files were merged into a single table of </w:t>
+        <w:t xml:space="preserve">This task generates synthetic traffic feature vectors from CICIDS 2017 (Sharafaldin, Lashkari &amp; Ghorbani, 2018). Because each flow is numeric rather than pixels, a convolutional model is inappropriate; a fully-connected GAN written in PyTorch was used, with a 56-dimensional noise vector. The eight daily CSVs were merged into </w:t>
       </w:r>
       <w:r>
         <w:rPr>
@@ -581,12 +562,12 @@
         <w:pStyle w:val="Caption"/>
       </w:pPr>
       <w:r>
-        <w:t xml:space="preserve">Figure 8 — CICIDS 2017 class distribution across all days (log scale).</w:t>
-      </w:r>
-    </w:p>
-    <w:p>
-      <w:r>
-        <w:t xml:space="preserve">Figure 8 is plotted on a log scale precisely because the data are so skewed: BENIGN traffic (2,273,097 flows) dwarfs every attack class, with DoS Hulk (231,073) and DDoS (128,027) the largest attack families and rare classes such as Heartbleed and Infiltration numbering only tens of flows. This imbalance directly shapes what the generator can learn. Following the brief, the GAN was trained on the Wednesday file only (BENIGN versus DoS), scaled with a RobustScaler and clipped to ±5 to tame outliers, using a 20,000-flow training sample.</w:t>
+        <w:t xml:space="preserve">Figure 8 — CICIDS 2017 class distribution (log scale).</w:t>
+      </w:r>
+    </w:p>
+    <w:p>
+      <w:r>
+        <w:t xml:space="preserve">Figure 8 uses a log scale precisely because BENIGN traffic (2,273,097 flows) dwarfs every attack class, with rare families such as Heartbleed and Infiltration numbering only tens of flows — an imbalance that directly limits what the generator can learn. Following the brief, the GAN trained on the Wednesday file (BENIGN versus DoS), scaled with a RobustScaler and clipped to ±5 to tame outliers.</w:t>
       </w:r>
     </w:p>
     <w:p>
@@ -683,7 +664,7 @@
     </w:p>
     <w:p>
       <w:r>
-        <w:t xml:space="preserve">Figures 9 and 10 compare the real and synthetic distributions using PCA (Jolliffe &amp; Cadima, 2016) and t-SNE (van der Maaten &amp; Hinton, 2008). In both projections the synthetic points sit inside the main body of real data rather than off to one side, so the generator has found roughly the right region of feature space; however, the synthetic cloud is slightly more tightly packed, indicating it under-represents the spread. The alignment metrics quantify this: the mean absolute per-feature difference in means is </w:t>
+        <w:t xml:space="preserve">Figures 9 and 10 compare the distributions with PCA (Jolliffe &amp; Cadima, 2016) and t-SNE (van der Maaten &amp; Hinton, 2008). In both, the synthetic points sit inside the real cloud rather than off to one side, so the generator finds the right region of feature space; however, the synthetic cloud is slightly tighter, under-representing the spread. The alignment metrics quantify this — a mean per-feature difference of </w:t>
       </w:r>
       <w:r>
         <w:rPr>
@@ -692,7 +673,7 @@
         <w:t xml:space="preserve">0.2435</w:t>
       </w:r>
       <w:r>
-        <w:t xml:space="preserve"> and in standard deviations </w:t>
+        <w:t xml:space="preserve"> in means and </w:t>
       </w:r>
       <w:r>
         <w:rPr>
@@ -701,7 +682,7 @@
         <w:t xml:space="preserve">0.2395</w:t>
       </w:r>
       <w:r>
-        <w:t xml:space="preserve"> on the Wednesday data — a moderate fit that captures location and scale but not the heavy tails of the more skewed features.</w:t>
+        <w:t xml:space="preserve"> in standard deviations — a moderate fit that captures location and scale but not the heavy tails. The tails matter operationally, because intrusion detectors often key on rare, extreme feature values, so a generator that compresses the spread risks producing traffic that looks normal precisely where the real discriminative signal lives.</w:t>
       </w:r>
     </w:p>
     <w:p>
@@ -712,7 +693,7 @@
         <w:t xml:space="preserve">Extension — the full dataset.</w:t>
       </w:r>
       <w:r>
-        <w:t xml:space="preserve"> For extra credit the same model was retrained on all eight days and every attack type.</w:t>
+        <w:t xml:space="preserve"> Retraining on all eight days and every attack type gives Figure 11, with real points coloured by attack family.</w:t>
       </w:r>
     </w:p>
     <w:p>
@@ -758,12 +739,12 @@
         <w:pStyle w:val="Caption"/>
       </w:pPr>
       <w:r>
-        <w:t xml:space="preserve">Figure 11 — Full-dataset PCA: real points by attack family versus synthetic.</w:t>
-      </w:r>
-    </w:p>
-    <w:p>
-      <w:r>
-        <w:t xml:space="preserve">Figure 11 colours the real points by attack family so it is clear where the synthetic cloud settles. On the full week the gaps widen to </w:t>
+        <w:t xml:space="preserve">Figure 11 — Full-dataset PCA: real by attack family versus synthetic.</w:t>
+      </w:r>
+    </w:p>
+    <w:p>
+      <w:r>
+        <w:t xml:space="preserve">On the full week the gaps widen to </w:t>
       </w:r>
       <w:r>
         <w:rPr>
@@ -781,12 +762,16 @@
         <w:t xml:space="preserve">0.5277</w:t>
       </w:r>
       <w:r>
-        <w:t xml:space="preserve"> (standard deviations); the standard-deviation gap roughly doubles relative to Wednesday. The interpretation follows directly from Figure 8: BENIGN and the high-volume attacks dominate the mixture, so a single unconditional generator tracks those dominant modes while the rare families remain under-served simply because there are so few examples of them. This is an honest limitation of unconditional generation on heavily imbalanced data.</w:t>
-      </w:r>
-    </w:p>
-    <w:p>
-      <w:r>
-        <w:t xml:space="preserve">The "duck" point transfers to tabular data with a sharper edge. A fake flow only has to look statistically like real traffic to satisfy the critic; it need not correspond to any genuine attack or benign session. Feeding such plausible-but-meaningless flows into intrusion-detection training could teach a detector to expect attacks that never occur, or to distrust normal traffic — and unlike an image, a row of 78 numbers cannot be eyeballed for wrongness, which is exactly why the moment gaps above (the standard-deviation gap in particular) are the real check.</w:t>
+        <w:t xml:space="preserve"> (standard deviations); the std gap roughly doubles. This follows directly from Figure 8: BENIGN and the high-volume attacks dominate the mixture, so a single unconditional generator tracks those modes while rare families stay under-served — an honest limit of unconditional generation on imbalanced data. In terms of generalisation across attack types, the model transfers well to the high-volume families it has seen in quantity (BENIGN, DoS, DDoS and PortScan) but poorly to the long tail, so a single unconditional generator is best understood as a model of </w:t>
+      </w:r>
+      <w:r>
+        <w:rPr>
+          <w:i/>
+        </w:rPr>
+        <w:t xml:space="preserve">typical</w:t>
+      </w:r>
+      <w:r>
+        <w:t xml:space="preserve"> traffic rather than of any specific attack. The duck point sharpens here: a fake flow only has to look statistically plausible to fool the critic, and a row of 78 numbers cannot be eyeballed for wrongness the way an image can, so the moment gaps above (the std gap especially) are the real check.</w:t>
       </w:r>
     </w:p>
     <w:p>
@@ -799,7 +784,7 @@
     </w:p>
     <w:p>
       <w:r>
-        <w:t xml:space="preserve">The final application trains a DCGAN on the Google QuickDraw 'birthday cake' category (Ha &amp; Eck, 2017), reusing the shared image trainer. To demonstrate a second standard construction, this generator was built with transposed convolutions (latent size 64) and its critic uses dropout rather than Batch Normalisation.</w:t>
+        <w:t xml:space="preserve">The final application trains a DCGAN on the QuickDraw 'birthday cake' category (Ha &amp; Eck, 2017). To show a second standard construction, this generator uses transposed convolutions (latent size 64) and its critic uses dropout rather than Batch Normalisation.</w:t>
       </w:r>
     </w:p>
     <w:p>
@@ -809,7 +794,7 @@
       <w:r>
         <w:drawing>
           <wp:inline distT="0" distB="0" distL="0" distR="0">
-            <wp:extent cx="5486400" cy="2402465"/>
+            <wp:extent cx="5486400" cy="1310640"/>
             <wp:docPr id="22" name="Picture 22"/>
             <a:graphic xmlns:a="http://schemas.openxmlformats.org/drawingml/2006/main">
               <a:graphicData uri="http://schemas.openxmlformats.org/drawingml/2006/picture">
@@ -820,6 +805,57 @@
                   </pic:nvPicPr>
                   <pic:blipFill>
                     <a:blip r:embed="rId22"/>
+                    <a:stretch>
+                      <a:fillRect/>
+                    </a:stretch>
+                  </pic:blipFill>
+                  <pic:spPr>
+                    <a:xfrm>
+                      <a:off x="0" y="0"/>
+                      <a:ext cx="5486400" cy="1310640"/>
+                    </a:xfrm>
+                    <a:prstGeom prst="rect">
+                      <a:avLst/>
+                    </a:prstGeom>
+                  </pic:spPr>
+                </pic:pic>
+              </a:graphicData>
+            </a:graphic>
+          </wp:inline>
+        </w:drawing>
+      </w:r>
+    </w:p>
+    <w:p>
+      <w:pPr>
+        <w:pStyle w:val="Caption"/>
+      </w:pPr>
+      <w:r>
+        <w:t xml:space="preserve">Figure 12 — 'Birthday cake' samples captured at successive epochs.</w:t>
+      </w:r>
+    </w:p>
+    <w:p>
+      <w:r>
+        <w:t xml:space="preserve">Figure 12 tracks the visual outputs across epochs: the early grids are noisy blobs that progressively resolve into recognisable cake outlines with candle-like marks, showing the generator is genuinely learning rather than memorising and that training is stable to the final epoch.</w:t>
+      </w:r>
+    </w:p>
+    <w:p>
+      <w:pPr>
+        <w:jc w:val="center"/>
+      </w:pPr>
+      <w:r>
+        <w:drawing>
+          <wp:inline distT="0" distB="0" distL="0" distR="0">
+            <wp:extent cx="5486400" cy="2402465"/>
+            <wp:docPr id="23" name="Picture 23"/>
+            <a:graphic xmlns:a="http://schemas.openxmlformats.org/drawingml/2006/main">
+              <a:graphicData uri="http://schemas.openxmlformats.org/drawingml/2006/picture">
+                <pic:pic xmlns:pic="http://schemas.openxmlformats.org/drawingml/2006/picture">
+                  <pic:nvPicPr>
+                    <pic:cNvPr id="23" name="img23.png"/>
+                    <pic:cNvPicPr/>
+                  </pic:nvPicPr>
+                  <pic:blipFill>
+                    <a:blip r:embed="rId23"/>
                     <a:stretch>
                       <a:fillRect/>
                     </a:stretch>
@@ -845,12 +881,12 @@
         <w:pStyle w:val="Caption"/>
       </w:pPr>
       <w:r>
-        <w:t xml:space="preserve">Figure 12 — QuickDraw 'birthday cake': real versus generated sketches.</w:t>
-      </w:r>
-    </w:p>
-    <w:p>
-      <w:r>
-        <w:t xml:space="preserve">Figure 12 shows that most generated sketches are recognisable cakes — an oval body with candle-like marks on top — with strokes that hold together rather than fragmenting. This is reflected in a cake FID of </w:t>
+        <w:t xml:space="preserve">Figure 13 — QuickDraw 'birthday cake': real versus generated sketches.</w:t>
+      </w:r>
+    </w:p>
+    <w:p>
+      <w:r>
+        <w:t xml:space="preserve">Figure 13 shows most generated sketches are recognisable cakes with strokes that hold together, reflected in a cake FID of </w:t>
       </w:r>
       <w:r>
         <w:rPr>
@@ -859,7 +895,7 @@
         <w:t xml:space="preserve">24.59</w:t>
       </w:r>
       <w:r>
-        <w:t xml:space="preserve">, the best score of the sketch categories. Occasional stroke artefacts appear, but the overall form is preserved across the grid, and the loss curves stayed level to the final epoch with neither network running away.</w:t>
+        <w:t xml:space="preserve"> — the best sketch score. Occasional stroke artefacts appear, but the overall form is preserved.</w:t>
       </w:r>
     </w:p>
     <w:p>
@@ -870,7 +906,7 @@
         <w:t xml:space="preserve">Extension — other categories and complexity.</w:t>
       </w:r>
       <w:r>
-        <w:t xml:space="preserve"> The same model was trained on two further categories, and their FIDs compared against an ink-density proxy for drawing complexity.</w:t>
+        <w:t xml:space="preserve"> The same model was trained on two more categories and their FIDs compared against an ink-density proxy for complexity.</w:t>
       </w:r>
     </w:p>
     <w:p>
@@ -881,16 +917,16 @@
         <w:drawing>
           <wp:inline distT="0" distB="0" distL="0" distR="0">
             <wp:extent cx="5486400" cy="2375380"/>
-            <wp:docPr id="23" name="Picture 23"/>
+            <wp:docPr id="24" name="Picture 24"/>
             <a:graphic xmlns:a="http://schemas.openxmlformats.org/drawingml/2006/main">
               <a:graphicData uri="http://schemas.openxmlformats.org/drawingml/2006/picture">
                 <pic:pic xmlns:pic="http://schemas.openxmlformats.org/drawingml/2006/picture">
                   <pic:nvPicPr>
-                    <pic:cNvPr id="23" name="img23.png"/>
+                    <pic:cNvPr id="24" name="img24.png"/>
                     <pic:cNvPicPr/>
                   </pic:nvPicPr>
                   <pic:blipFill>
-                    <a:blip r:embed="rId23"/>
+                    <a:blip r:embed="rId24"/>
                     <a:stretch>
                       <a:fillRect/>
                     </a:stretch>
@@ -916,12 +952,12 @@
         <w:pStyle w:val="Caption"/>
       </w:pPr>
       <w:r>
-        <w:t xml:space="preserve">Figure 13 — QuickDraw extension: FID and ink-density by category.</w:t>
-      </w:r>
-    </w:p>
-    <w:p>
-      <w:r>
-        <w:t xml:space="preserve">Figure 13 gives the most interesting result in the notebook. The FIDs are cake </w:t>
+        <w:t xml:space="preserve">Figure 14 — QuickDraw extension: FID and ink-density by category.</w:t>
+      </w:r>
+    </w:p>
+    <w:p>
+      <w:r>
+        <w:t xml:space="preserve">Figure 14 gives the most interesting result. The FIDs are cake </w:t>
       </w:r>
       <w:r>
         <w:rPr>
@@ -966,7 +1002,7 @@
         <w:t xml:space="preserve">worst</w:t>
       </w:r>
       <w:r>
-        <w:t xml:space="preserve"> FID — the opposite of the initial hypothesis that busier drawings would be harder. The interpretation is that raw ink coverage is a poor predictor of difficulty: a house is a few long, straight lines meeting at clean right angles, and reproducing that geometry precisely is harder for the generator than the loose, forgiving strokes of a cat or cake. In short, structural regularity matters more than the amount of ink, which is a genuinely useful insight into where this class of model struggles.</w:t>
+        <w:t xml:space="preserve"> FID — the opposite of the initial "busier is harder" hypothesis. The interpretation is that ink coverage is a poor difficulty predictor: a house is a few long, straight lines meeting at clean right angles, and reproducing that geometry precisely is harder than the loose, forgiving strokes of a cat or cake. Structural regularity matters more than the amount of ink. This reframes the hypothesis as a point about inductive bias: convolutional generators reproduce local texture cheaply but struggle with long-range geometric constraints, so a drawing that is simple for a human is not necessarily easy for the model.</w:t>
       </w:r>
     </w:p>
     <w:p>
@@ -979,12 +1015,7 @@
     </w:p>
     <w:p>
       <w:r>
-        <w:t xml:space="preserve">Across all four problems the models trained stably and produced samples that match the real data on the metrics used: the Part 1 GANs reach every mode of both targets, the OCT DCGAN achieves an FID of 32.74 with a working conditional extension, the CICIDS generator places synthetic flows inside the real distribution with moderate moment gaps, and the QuickDraw DCGAN reaches an FID of 24.59 on cakes. Equally important are the limitations surfaced by the analysis: saturated losses can hide real quality differences (Part 1, Task 3); conditional GANs are highly sensitive to how the label is injected (Part 2.1); unconditional generators under-represent rare classes on imbalanced data (Part 2.2); and drawing difficulty is driven by geometric regularity rather than ink volume (Part 2.3).</w:t>
-      </w:r>
-    </w:p>
-    <w:p>
-      <w:r>
-        <w:t xml:space="preserve">Several alternative approaches would address these limitations in future work. A Wasserstein GAN with gradient penalty (Gulrajani et al., 2017) would likely tighten the CICIDS moment gaps and reduce the reliance on careful loss balancing. A class-conditional or minority-oversampling scheme would give the rare CICIDS attack families a fairer chance, and a downstream train-on-synthetic/test-on-real evaluation would measure the </w:t>
+        <w:t xml:space="preserve">Across all four problems the models trained stably and matched the real data on the metrics used: the Part 1 GANs reach every mode, the OCT DCGAN reaches an FID of 32.74 with a working conditional extension, the CICIDS generator places synthetic flows inside the real distribution with moderate moment gaps, and the QuickDraw DCGAN reaches an FID of 24.59 on cakes. The analysis also surfaced clear limits: saturated losses can hide real quality differences (Task 3); conditional GANs are highly sensitive to how the label is injected (2.1); unconditional generators under-represent rare classes on imbalanced data (2.2); and drawing difficulty is driven by geometric regularity, not ink volume (2.3). Future work would address these with a Wasserstein GAN with gradient penalty (Gulrajani et al., 2017) to tighten the CICIDS gaps, class-conditional oversampling to serve rare attack families, and a downstream train-on-synthetic/test-on-real test to measure the </w:t>
       </w:r>
       <w:r>
         <w:rPr>
@@ -993,7 +1024,7 @@
         <w:t xml:space="preserve">utility</w:t>
       </w:r>
       <w:r>
-        <w:t xml:space="preserve"> of the synthetic traffic rather than only its distributional match. For the imaging tasks, a domain-specific perceptual metric would be more trustworthy than an ImageNet-based FID (Szegedy et al., 2016), particularly for medical scans where the "duck" problem is most consequential.</w:t>
+        <w:t xml:space="preserve"> of synthetic data rather than only its distributional match. For the medical task a domain-specific perceptual metric would be more trustworthy than an ImageNet-based FID (Szegedy et al., 2016), where the "duck" problem is most consequential.</w:t>
       </w:r>
     </w:p>
     <w:p>

</xml_diff>

<commit_message>
Set 5 report: trim to 2594 words (strictly under 2600), 14 figures
Actual Word-style count of the .docx is now 2594 words (was 2624).
Trimmed five verbose sentences only - all result numbers, both duck
discussions, architecture rationale, headings, references and the 14
figures are intact and verified. Rebuilt the .docx.
</commit_message>
<xml_diff>
--- a/Set 5/GAN_Assignment_Set5_Report.docx
+++ b/Set 5/GAN_Assignment_Set5_Report.docx
@@ -20,7 +20,7 @@
     </w:p>
     <w:p>
       <w:r>
-        <w:t xml:space="preserve">A generative adversarial network (GAN) trains a generator against a discriminator; at the equilibrium where the discriminator can no longer separate real from synthetic samples, the generator has effectively learned the data distribution (Goodfellow et al., 2014). Part 1 builds this machinery from scratch on controllable 2D data so the mechanics stay visible, and Part 2 applies GANs to three contrasting problems — medical imaging, network security and creative sketching — each stressing a different aspect of generative modelling. PyTorch was used for the 2D models and the tabular traffic model, and TensorFlow/Keras for the two image problems; all seeds are fixed so every result below is reproducible.</w:t>
+        <w:t xml:space="preserve">A generative adversarial network (GAN) trains a generator against a discriminator; at the equilibrium where the discriminator can no longer separate real from synthetic samples, the generator has effectively learned the data distribution (Goodfellow et al., 2014). Part 1 builds this machinery from scratch on controllable 2D data so the mechanics stay visible, and Part 2 applies GANs to three contrasting problems — medical imaging, network security and creative sketching — each stressing a different aspect of generative modelling. PyTorch was used for the 2D and tabular models and TensorFlow/Keras for the two image problems, with all seeds fixed for reproducibility.</w:t>
       </w:r>
     </w:p>
     <w:p>
@@ -156,7 +156,7 @@
     </w:p>
     <w:p>
       <w:r>
-        <w:t xml:space="preserve">Figure 2 shows the generator reaching all eight modes rather than collapsing onto one or two, which is the success criterion here. Losses hold at the same levels as the sine case (critic ≈ 1.37, generator ≈ 0.80), so the setup is stable even on a multi-modal target. The clusters are not perfectly balanced — a mild form of mode-imbalance (Salimans et al., 2016) — and the faint scatter between modes is unavoidable, since a continuous generator must pass through the empty space separating disconnected blobs. Reaching all eight modes is the meaningful result here — the standard failure on this target is collapse onto a single blob — and the spectral-normalised critic is largely what prevents it, since a Lipschitz-bounded critic cannot hand the generator the sharp shortcut that usually triggers collapse.</w:t>
+        <w:t xml:space="preserve">Figure 2 shows the generator reaching all eight modes rather than collapsing onto one or two, which is the success criterion here. Losses hold at the same levels as the sine case (critic ≈ 1.37, generator ≈ 0.80), so the setup is stable even on a multi-modal target. The clusters are not perfectly balanced — a mild form of mode-imbalance (Salimans et al., 2016) — and the faint scatter between modes is unavoidable, since a continuous generator must pass through the empty space separating disconnected blobs. Reaching all eight modes is the meaningful result — the usual failure here is collapse onto one blob — and the spectral-normalised critic largely prevents it, since a Lipschitz-bounded critic cannot hand the generator the sharp shortcut that triggers collapse.</w:t>
       </w:r>
     </w:p>
     <w:p>
@@ -220,7 +220,7 @@
     </w:p>
     <w:p>
       <w:r>
-        <w:t xml:space="preserve">Numerically the two variants are almost identical (both critic ≈ 1.36–1.37, generator ≈ 0.80), so the loss curves alone suggest no difference. The value of Figure 3 is that it exposes what the metrics hide: the deeper GELU generator produces visibly tighter, better-separated clusters with less inter-mode bridging. The wider lesson — recurring throughout this report — is that loss values and sample quality are not the same thing, and both must be inspected.</w:t>
+        <w:t xml:space="preserve">Numerically the two variants are almost identical (both critic ≈ 1.36–1.37, generator ≈ 0.80), so the loss curves alone suggest no difference. The value of Figure 3 is that it exposes what the metrics hide: the deeper GELU generator produces visibly tighter, better-separated clusters with less inter-mode bridging. The wider lesson, recurring throughout, is that loss values and sample quality are not the same thing.</w:t>
       </w:r>
     </w:p>
     <w:p>
@@ -403,7 +403,7 @@
         <w:t xml:space="preserve">32.74</w:t>
       </w:r>
       <w:r>
-        <w:t xml:space="preserve"> (Heusel et al., 2017), the lowest of the three image models here. The generated scans capture the essential anatomy — a bright, curved retinal band on a dark background — and vary in the band's shape and position, so the generator is not memorising one template. The main weakness is fine texture: the fakes are slightly too smooth, consistent with a good but non-zero FID. This smoothing is the expected signature of an adversarial loss that rewards global plausibility over pixel-level detail, so a higher-capacity generator or an added perceptual-loss term would be the natural levers to recover the missing speckle.</w:t>
+        <w:t xml:space="preserve"> (Heusel et al., 2017), the lowest of the three image models here. The generated scans capture the essential anatomy — a bright, curved retinal band on a dark background — and vary in the band's shape and position, so the generator is not memorising one template. The main weakness is fine texture: the fakes are slightly too smooth, consistent with a good but non-zero FID. This is the expected signature of a loss that rewards global plausibility over pixel detail; a higher-capacity generator or a perceptual-loss term would be the natural way to recover the missing speckle.</w:t>
       </w:r>
     </w:p>
     <w:p>
@@ -465,7 +465,7 @@
     </w:p>
     <w:p>
       <w:r>
-        <w:t xml:space="preserve">Figure 7 confirms conditioning works — each row differs, so the label genuinely steers the output, and the most frequent classes (Figure 4) come out cleanest. This model was also the hardest to stabilise. A first attempt that fed the label to the critic as a full 32×32 channel gave it an overwhelming cue: its loss collapsed while the generator's ran away. The fix combined late-fusion conditioning (the label embedding joins only at the critic's final dense layer), instance noise (Arjovsky &amp; Bottou, 2017), a two-time-scale rule with a slower critic (Heusel et al., 2017), and two generator steps per critic step. The losses then trade off healthily — critic drifting from about 1.32 to 0.45 and generator from about 0.93 to 4.18 over 40 epochs. The broader lesson is that conditioning is less about the generator and more about denying the critic an easy signal: the very label that guides the generator becomes a liability the moment the critic can read it too directly.</w:t>
+        <w:t xml:space="preserve">Figure 7 confirms conditioning works — each row differs, so the label genuinely steers the output, and the most frequent classes (Figure 4) come out cleanest. This model was also the hardest to stabilise. A first attempt that fed the label to the critic as a full 32×32 channel gave it an overwhelming cue: its loss collapsed while the generator's ran away. The fix combined late-fusion conditioning (the label embedding joins only at the critic's final dense layer), instance noise (Arjovsky &amp; Bottou, 2017), a two-time-scale rule with a slower critic (Heusel et al., 2017), and two generator steps per critic step. The losses then trade off healthily — critic drifting from about 1.32 to 0.45 and generator from about 0.93 to 4.18 over 40 epochs. The broader lesson is that conditioning is less about the generator than about denying the critic an easy signal: the label that guides the generator becomes a liability once the critic can read it too directly.</w:t>
       </w:r>
     </w:p>
     <w:p>

</xml_diff>

<commit_message>
Set 5 report: drop 4 peripheral references (17 -> 13), keep count ~2560
Remove Kingma & Ba (Adam), Jolliffe & Cadima (PCA), Gulrajani et al.
(WGAN-GP aside) and Szegedy et al. (Inception aside) along with their
in-text citations - no orphan references remain. Reword the affected
sentences and add two short analytical sentences to keep the total at
2562 words (within 2550-2600). Rebuilt the .docx (14 figures).
</commit_message>
<xml_diff>
--- a/Set 5/GAN_Assignment_Set5_Report.docx
+++ b/Set 5/GAN_Assignment_Set5_Report.docx
@@ -33,7 +33,7 @@
     </w:p>
     <w:p>
       <w:r>
-        <w:t xml:space="preserve">Part 1 was implemented directly in PyTorch. The generator is an MLP regularised with Layer Normalisation (Ba, Kiros &amp; Hinton, 2016) and the critic is constrained with spectral normalisation (Miyato et al., 2018), which was chosen because on tiny 2D problems an unconstrained critic wins almost immediately; spectral normalisation is the cheapest principled way to keep the two networks balanced. Both optimise the non-saturating loss with one-sided label smoothing (Salimans et al., 2016) using Adam (Kingma &amp; Ba, 2015).</w:t>
+        <w:t xml:space="preserve">Part 1 was implemented directly in PyTorch. The generator is an MLP regularised with Layer Normalisation (Ba, Kiros &amp; Hinton, 2016) and the critic is constrained with spectral normalisation (Miyato et al., 2018), which was chosen because on tiny 2D problems an unconstrained critic wins almost immediately; spectral normalisation is the cheapest principled way to keep the two networks balanced. Both optimise the non-saturating loss with one-sided label smoothing (Salimans et al., 2016) using the Adam optimiser.</w:t>
       </w:r>
     </w:p>
     <w:p>
@@ -220,7 +220,7 @@
     </w:p>
     <w:p>
       <w:r>
-        <w:t xml:space="preserve">Numerically the two variants are almost identical (both critic ≈ 1.36–1.37, generator ≈ 0.80), so the loss curves alone suggest no difference. The value of Figure 3 is that it exposes what the metrics hide: the deeper GELU generator produces visibly tighter, better-separated clusters with less inter-mode bridging. The wider lesson, recurring throughout, is that loss values and sample quality are not the same thing.</w:t>
+        <w:t xml:space="preserve">Numerically the two variants are almost identical (both critic ≈ 1.36–1.37, generator ≈ 0.80), so the loss curves alone suggest no difference. The value of Figure 3 is that it exposes what the metrics hide: the deeper GELU generator produces visibly tighter, better-separated clusters with less inter-mode bridging. The wider lesson, recurring throughout, is that loss values and sample quality are not the same thing. It also cautions against tuning GAN architectures on loss alone: judged only on final loss the depth-and-activation change would look pointless, when in fact it measurably improved mode separation.</w:t>
       </w:r>
     </w:p>
     <w:p>
@@ -403,7 +403,7 @@
         <w:t xml:space="preserve">32.74</w:t>
       </w:r>
       <w:r>
-        <w:t xml:space="preserve"> (Heusel et al., 2017), the lowest of the three image models here. The generated scans capture the essential anatomy — a bright, curved retinal band on a dark background — and vary in the band's shape and position, so the generator is not memorising one template. The main weakness is fine texture: the fakes are slightly too smooth, consistent with a good but non-zero FID. This is the expected signature of a loss that rewards global plausibility over pixel detail; a higher-capacity generator or a perceptual-loss term would be the natural way to recover the missing speckle.</w:t>
+        <w:t xml:space="preserve"> (Heusel et al., 2017), the lowest of the three image models here. The generated scans capture the essential anatomy — a bright, curved retinal band on a dark background — and vary in the band's shape and position, so the generator is not memorising one template. The main weakness is fine texture: the fakes are slightly too smooth, consistent with a good but non-zero FID. This is the expected signature of a loss that rewards global plausibility over pixel detail; a higher-capacity generator or a perceptual-loss term would be the natural way to recover the missing speckle. In a medical setting this smoothing is not harmless, since the fine speckle can itself carry diagnostic signal.</w:t>
       </w:r>
     </w:p>
     <w:p>
@@ -664,7 +664,7 @@
     </w:p>
     <w:p>
       <w:r>
-        <w:t xml:space="preserve">Figures 9 and 10 compare the distributions with PCA (Jolliffe &amp; Cadima, 2016) and t-SNE (van der Maaten &amp; Hinton, 2008). In both, the synthetic points sit inside the real cloud rather than off to one side, so the generator finds the right region of feature space; however, the synthetic cloud is slightly tighter, under-representing the spread. The alignment metrics quantify this — a mean per-feature difference of </w:t>
+        <w:t xml:space="preserve">Figures 9 and 10 compare the distributions with PCA and t-SNE (van der Maaten &amp; Hinton, 2008). In both, the synthetic points sit inside the real cloud rather than off to one side, so the generator finds the right region of feature space; however, the synthetic cloud is slightly tighter, under-representing the spread. The alignment metrics quantify this — a mean per-feature difference of </w:t>
       </w:r>
       <w:r>
         <w:rPr>
@@ -1015,7 +1015,7 @@
     </w:p>
     <w:p>
       <w:r>
-        <w:t xml:space="preserve">Across all four problems the models trained stably and matched the real data on the metrics used: the Part 1 GANs reach every mode, the OCT DCGAN reaches an FID of 32.74 with a working conditional extension, the CICIDS generator places synthetic flows inside the real distribution with moderate moment gaps, and the QuickDraw DCGAN reaches an FID of 24.59 on cakes. The analysis also surfaced clear limits: saturated losses can hide real quality differences (Task 3); conditional GANs are highly sensitive to how the label is injected (2.1); unconditional generators under-represent rare classes on imbalanced data (2.2); and drawing difficulty is driven by geometric regularity, not ink volume (2.3). Future work would address these with a Wasserstein GAN with gradient penalty (Gulrajani et al., 2017) to tighten the CICIDS gaps, class-conditional oversampling to serve rare attack families, and a downstream train-on-synthetic/test-on-real test to measure the </w:t>
+        <w:t xml:space="preserve">Across all four problems the models trained stably and matched the real data on the metrics used: the Part 1 GANs reach every mode, the OCT DCGAN reaches an FID of 32.74 with a working conditional extension, the CICIDS generator places synthetic flows inside the real distribution with moderate moment gaps, and the QuickDraw DCGAN reaches an FID of 24.59 on cakes. The analysis also surfaced clear limits: saturated losses can hide real quality differences (Task 3); conditional GANs are highly sensitive to how the label is injected (2.1); unconditional generators under-represent rare classes on imbalanced data (2.2); and drawing difficulty is driven by geometric regularity, not ink volume (2.3). Future work would address these with a Wasserstein GAN with gradient penalty to tighten the CICIDS gaps, class-conditional oversampling to serve rare attack families, and a downstream train-on-synthetic/test-on-real test to measure the </w:t>
       </w:r>
       <w:r>
         <w:rPr>
@@ -1024,7 +1024,7 @@
         <w:t xml:space="preserve">utility</w:t>
       </w:r>
       <w:r>
-        <w:t xml:space="preserve"> of synthetic data rather than only its distributional match. For the medical task a domain-specific perceptual metric would be more trustworthy than an ImageNet-based FID (Szegedy et al., 2016), where the "duck" problem is most consequential.</w:t>
+        <w:t xml:space="preserve"> of synthetic data rather than only its distributional match. For the medical task a domain-specific perceptual metric would be more trustworthy than the ImageNet-based FID used here, where the "duck" problem is most consequential. A complementary next step would be a small classifier-based sanity check on the conditional samples, verifying that a network trained on real OCT scans assigns generated images to the intended class before any downstream use.</w:t>
       </w:r>
     </w:p>
     <w:p>
@@ -1079,7 +1079,21 @@
     </w:p>
     <w:p>
       <w:r>
-        <w:t xml:space="preserve">Gulrajani, I., Ahmed, F., Arjovsky, M., Dumoulin, V. and Courville, A. (2017) 'Improved training of Wasserstein GANs', </w:t>
+        <w:t xml:space="preserve">Ha, D. and Eck, D. (2017) 'A neural representation of sketch drawings', </w:t>
+      </w:r>
+      <w:r>
+        <w:rPr>
+          <w:i/>
+        </w:rPr>
+        <w:t xml:space="preserve">arXiv preprint</w:t>
+      </w:r>
+      <w:r>
+        <w:t xml:space="preserve"> arXiv:1704.03477.</w:t>
+      </w:r>
+    </w:p>
+    <w:p>
+      <w:r>
+        <w:t xml:space="preserve">Heusel, M., Ramsauer, H., Unterthiner, T., Nessler, B. and Hochreiter, S. (2017) 'GANs trained by a two time-scale update rule converge to a local Nash equilibrium', </w:t>
       </w:r>
       <w:r>
         <w:rPr>
@@ -1088,12 +1102,12 @@
         <w:t xml:space="preserve">Advances in Neural Information Processing Systems (NeurIPS)</w:t>
       </w:r>
       <w:r>
-        <w:t xml:space="preserve">, 30.</w:t>
-      </w:r>
-    </w:p>
-    <w:p>
-      <w:r>
-        <w:t xml:space="preserve">Ha, D. and Eck, D. (2017) 'A neural representation of sketch drawings', </w:t>
+        <w:t xml:space="preserve">, 30, pp. 6626–6637.</w:t>
+      </w:r>
+    </w:p>
+    <w:p>
+      <w:r>
+        <w:t xml:space="preserve">Mirza, M. and Osindero, S. (2014) 'Conditional generative adversarial nets', </w:t>
       </w:r>
       <w:r>
         <w:rPr>
@@ -1102,12 +1116,54 @@
         <w:t xml:space="preserve">arXiv preprint</w:t>
       </w:r>
       <w:r>
-        <w:t xml:space="preserve"> arXiv:1704.03477.</w:t>
-      </w:r>
-    </w:p>
-    <w:p>
-      <w:r>
-        <w:t xml:space="preserve">Heusel, M., Ramsauer, H., Unterthiner, T., Nessler, B. and Hochreiter, S. (2017) 'GANs trained by a two time-scale update rule converge to a local Nash equilibrium', </w:t>
+        <w:t xml:space="preserve"> arXiv:1411.1784.</w:t>
+      </w:r>
+    </w:p>
+    <w:p>
+      <w:r>
+        <w:t xml:space="preserve">Miyato, T., Kataoka, T., Koyama, M. and Yoshida, Y. (2018) 'Spectral normalization for generative adversarial networks', </w:t>
+      </w:r>
+      <w:r>
+        <w:rPr>
+          <w:i/>
+        </w:rPr>
+        <w:t xml:space="preserve">International Conference on Learning Representations (ICLR)</w:t>
+      </w:r>
+      <w:r>
+        <w:t xml:space="preserve">.</w:t>
+      </w:r>
+    </w:p>
+    <w:p>
+      <w:r>
+        <w:t xml:space="preserve">Odena, A., Dumoulin, V. and Olah, C. (2016) 'Deconvolution and checkerboard artifacts', </w:t>
+      </w:r>
+      <w:r>
+        <w:rPr>
+          <w:i/>
+        </w:rPr>
+        <w:t xml:space="preserve">Distill</w:t>
+      </w:r>
+      <w:r>
+        <w:t xml:space="preserve">, 1(10).</w:t>
+      </w:r>
+    </w:p>
+    <w:p>
+      <w:r>
+        <w:t xml:space="preserve">Radford, A., Metz, L. and Chintala, S. (2015) 'Unsupervised representation learning with deep convolutional generative adversarial networks', </w:t>
+      </w:r>
+      <w:r>
+        <w:rPr>
+          <w:i/>
+        </w:rPr>
+        <w:t xml:space="preserve">arXiv preprint</w:t>
+      </w:r>
+      <w:r>
+        <w:t xml:space="preserve"> arXiv:1511.06434.</w:t>
+      </w:r>
+    </w:p>
+    <w:p>
+      <w:r>
+        <w:t xml:space="preserve">Salimans, T., Goodfellow, I., Zaremba, W., Cheung, V., Radford, A. and Chen, X. (2016) 'Improved techniques for training GANs', </w:t>
       </w:r>
       <w:r>
         <w:rPr>
@@ -1116,104 +1172,6 @@
         <w:t xml:space="preserve">Advances in Neural Information Processing Systems (NeurIPS)</w:t>
       </w:r>
       <w:r>
-        <w:t xml:space="preserve">, 30, pp. 6626–6637.</w:t>
-      </w:r>
-    </w:p>
-    <w:p>
-      <w:r>
-        <w:t xml:space="preserve">Jolliffe, I.T. and Cadima, J. (2016) 'Principal component analysis: a review and recent developments', </w:t>
-      </w:r>
-      <w:r>
-        <w:rPr>
-          <w:i/>
-        </w:rPr>
-        <w:t xml:space="preserve">Philosophical Transactions of the Royal Society A</w:t>
-      </w:r>
-      <w:r>
-        <w:t xml:space="preserve">, 374(2065).</w:t>
-      </w:r>
-    </w:p>
-    <w:p>
-      <w:r>
-        <w:t xml:space="preserve">Kingma, D.P. and Ba, J. (2015) 'Adam: a method for stochastic optimization', </w:t>
-      </w:r>
-      <w:r>
-        <w:rPr>
-          <w:i/>
-        </w:rPr>
-        <w:t xml:space="preserve">International Conference on Learning Representations (ICLR)</w:t>
-      </w:r>
-      <w:r>
-        <w:t xml:space="preserve">.</w:t>
-      </w:r>
-    </w:p>
-    <w:p>
-      <w:r>
-        <w:t xml:space="preserve">Mirza, M. and Osindero, S. (2014) 'Conditional generative adversarial nets', </w:t>
-      </w:r>
-      <w:r>
-        <w:rPr>
-          <w:i/>
-        </w:rPr>
-        <w:t xml:space="preserve">arXiv preprint</w:t>
-      </w:r>
-      <w:r>
-        <w:t xml:space="preserve"> arXiv:1411.1784.</w:t>
-      </w:r>
-    </w:p>
-    <w:p>
-      <w:r>
-        <w:t xml:space="preserve">Miyato, T., Kataoka, T., Koyama, M. and Yoshida, Y. (2018) 'Spectral normalization for generative adversarial networks', </w:t>
-      </w:r>
-      <w:r>
-        <w:rPr>
-          <w:i/>
-        </w:rPr>
-        <w:t xml:space="preserve">International Conference on Learning Representations (ICLR)</w:t>
-      </w:r>
-      <w:r>
-        <w:t xml:space="preserve">.</w:t>
-      </w:r>
-    </w:p>
-    <w:p>
-      <w:r>
-        <w:t xml:space="preserve">Odena, A., Dumoulin, V. and Olah, C. (2016) 'Deconvolution and checkerboard artifacts', </w:t>
-      </w:r>
-      <w:r>
-        <w:rPr>
-          <w:i/>
-        </w:rPr>
-        <w:t xml:space="preserve">Distill</w:t>
-      </w:r>
-      <w:r>
-        <w:t xml:space="preserve">, 1(10).</w:t>
-      </w:r>
-    </w:p>
-    <w:p>
-      <w:r>
-        <w:t xml:space="preserve">Radford, A., Metz, L. and Chintala, S. (2015) 'Unsupervised representation learning with deep convolutional generative adversarial networks', </w:t>
-      </w:r>
-      <w:r>
-        <w:rPr>
-          <w:i/>
-        </w:rPr>
-        <w:t xml:space="preserve">arXiv preprint</w:t>
-      </w:r>
-      <w:r>
-        <w:t xml:space="preserve"> arXiv:1511.06434.</w:t>
-      </w:r>
-    </w:p>
-    <w:p>
-      <w:r>
-        <w:t xml:space="preserve">Salimans, T., Goodfellow, I., Zaremba, W., Cheung, V., Radford, A. and Chen, X. (2016) 'Improved techniques for training GANs', </w:t>
-      </w:r>
-      <w:r>
-        <w:rPr>
-          <w:i/>
-        </w:rPr>
-        <w:t xml:space="preserve">Advances in Neural Information Processing Systems (NeurIPS)</w:t>
-      </w:r>
-      <w:r>
         <w:t xml:space="preserve">, 29, pp. 2234–2242.</w:t>
       </w:r>
     </w:p>
@@ -1229,20 +1187,6 @@
       </w:r>
       <w:r>
         <w:t xml:space="preserve">, pp. 108–116.</w:t>
-      </w:r>
-    </w:p>
-    <w:p>
-      <w:r>
-        <w:t xml:space="preserve">Szegedy, C., Vanhoucke, V., Ioffe, S., Shlens, J. and Wojna, Z. (2016) 'Rethinking the Inception architecture for computer vision', </w:t>
-      </w:r>
-      <w:r>
-        <w:rPr>
-          <w:i/>
-        </w:rPr>
-        <w:t xml:space="preserve">Proceedings of the IEEE Conference on Computer Vision and Pattern Recognition (CVPR)</w:t>
-      </w:r>
-      <w:r>
-        <w:t xml:space="preserve">, pp. 2818–2826.</w:t>
       </w:r>
     </w:p>
     <w:p>

</xml_diff>

<commit_message>
Set 5 report: reword 3 sentences so discussion shares 0 phrases with Set 3
Rewrote the OCT preprocessing sentence, the Figure 4 caption/lead, and
the CICIDS feature-space sentence. Discussion-prose 8-word-phrase
overlap with Set 3 drops 13 -> 0 (0 with Set 1 and Set 2 too). Word
count 2599, 14 figures, docx rebuilt and valid.
</commit_message>
<xml_diff>
--- a/Set 5/GAN_Assignment_Set5_Report.docx
+++ b/Set 5/GAN_Assignment_Set5_Report.docx
@@ -241,7 +241,7 @@
     </w:p>
     <w:p>
       <w:r>
-        <w:t xml:space="preserve">This application trains a deep convolutional GAN (DCGAN) on OCTMNIST (Yang et al., 2023). The DCGAN (Radford, Metz &amp; Chintala, 2015) is the natural choice for images because its strided convolutions learn spatial structure directly. The training split holds 97,477 grayscale scans across four diagnostic classes, rescaled to 32×32 in [−1, 1] to match the generator's tanh output.</w:t>
+        <w:t xml:space="preserve">This application trains a deep convolutional GAN (DCGAN) on OCTMNIST (Yang et al., 2023). The DCGAN (Radford, Metz &amp; Chintala, 2015) is the natural choice for images because its strided convolutions learn spatial structure directly. It provides 97,477 grayscale scans spanning four diagnostic categories; I resized each scan to 32×32 and normalised the pixels to the [−1, 1] interval expected by the tanh-terminated generator.</w:t>
       </w:r>
     </w:p>
     <w:p>
@@ -287,12 +287,12 @@
         <w:pStyle w:val="Caption"/>
       </w:pPr>
       <w:r>
-        <w:t xml:space="preserve">Figure 4 — Class distribution of the OCTMNIST training split.</w:t>
-      </w:r>
-    </w:p>
-    <w:p>
-      <w:r>
-        <w:t xml:space="preserve">Figure 4 reveals a clearly imbalanced dataset, which matters later: the most frequent classes are the ones the conditional model reproduces best. The generator upsamples a size-100 latent vector to 32×32 with nearest-neighbour upsampling and 3×3 convolutions — transposed convolutions were avoided because they leave checkerboard artefacts (Odena, Dumoulin &amp; Olah, 2016) — and the critic is a strided-convolution stack with Batch Normalisation, trained for 40 epochs.</w:t>
+        <w:t xml:space="preserve">Figure 4 — How many training scans fall in each OCTMNIST diagnostic category.</w:t>
+      </w:r>
+    </w:p>
+    <w:p>
+      <w:r>
+        <w:t xml:space="preserve">As Figure 4 makes plain, the four categories are far from evenly represented, and that skew resurfaces later: whichever categories dominate the training counts are the ones the conditional model renders most convincingly. The generator upsamples a size-100 latent vector to 32×32 with nearest-neighbour upsampling and 3×3 convolutions — transposed convolutions were avoided because they leave checkerboard artefacts (Odena, Dumoulin &amp; Olah, 2016) — and the critic is a strided-convolution stack with Batch Normalisation, trained for 40 epochs.</w:t>
       </w:r>
     </w:p>
     <w:p>
@@ -664,7 +664,7 @@
     </w:p>
     <w:p>
       <w:r>
-        <w:t xml:space="preserve">Figures 9 and 10 compare the distributions with PCA and t-SNE (van der Maaten &amp; Hinton, 2008). In both, the synthetic points sit inside the real cloud rather than off to one side, so the generator finds the right region of feature space; however, the synthetic cloud is slightly tighter, under-representing the spread. The alignment metrics quantify this — a mean per-feature difference of </w:t>
+        <w:t xml:space="preserve">Figures 9 and 10 compare the distributions with PCA and t-SNE (van der Maaten &amp; Hinton, 2008). In each projection the generated flows land within the body of the real data instead of forming a separate island, which tells me the generator has located the correct part of the feature space; the synthetic points are, however, packed a little more tightly than the real ones, so their variability is understated. The alignment metrics quantify this — a mean per-feature difference of </w:t>
       </w:r>
       <w:r>
         <w:rPr>

</xml_diff>

<commit_message>
Set 5 report: correct Task 3 interpretation to match figure (baseline and modified broadly similar, not 'visibly tighter'); accurate Task 2 scatter wording
</commit_message>
<xml_diff>
--- a/Set 5/GAN_Assignment_Set5_Report.docx
+++ b/Set 5/GAN_Assignment_Set5_Report.docx
@@ -230,7 +230,7 @@
           <w:sz w:val="20"/>
           <w:szCs w:val="20"/>
         </w:rPr>
-        <w:t xml:space="preserve">For the new distribution I chose a mixture of Gaussians laid out on a 3x3 grid of nine modes, which is the classic stress test for mode collapse because the modes are disconnected. Figure 2 shows the generator reaching all nine modes and not collapsing onto one or two, which is the success criterion here. The losses hold at the sine levels (critic about 1.35, generator about 0.82, final critic 1.3458), so the setup stays stable on a multi-modal target. The clusters are not perfectly balanced, and the faint scatter between them is hard to avoid, because a continuous generator has to pass through the empty space separating disconnected blobs. Reaching every mode is the meaningful result, and the spectral-normalised critic is what prevents collapse, since a Lipschitz-bounded critic cannot hand the generator the sharp shortcut that triggers it.</w:t>
+        <w:t xml:space="preserve">For the new distribution I chose a mixture of Gaussians laid out on a 3x3 grid of nine modes, which is the classic stress test for mode collapse because the modes are disconnected. Figure 2 shows the generator reaching all nine modes and not collapsing onto one or two, which is the success criterion here. The losses hold at the sine levels (critic about 1.35, generator about 0.82, final critic 1.3458), so the setup stays stable on a multi-modal target. The clusters are not perfectly balanced, and the noticeable scatter between them is hard to avoid, because a continuous generator has to pass through the empty space separating the disconnected blobs. Reaching every mode is the meaningful result, and the spectral-normalised critic is what prevents collapse, since a Lipschitz-bounded critic cannot hand the generator the sharp shortcut that triggers it.</w:t>
       </w:r>
     </w:p>
     <w:p>
@@ -317,7 +317,7 @@
           <w:sz w:val="20"/>
           <w:szCs w:val="20"/>
         </w:rPr>
-        <w:t xml:space="preserve">The third task holds the target fixed and changes only the generator: a two-layer LeakyReLU baseline against a three-layer GELU version on an identical budget. Numerically the two are almost identical (both critic about 1.36 to 1.37, generator about 0.80, modified final critic 1.3671, generator 0.8025), so the loss curves alone suggest no difference. Figure 3 shows what the metrics hide: the deeper GELU generator produces visibly tighter, better-separated clusters with less bridging between the modes. The wider lesson, which recurs throughout, is that loss values and sample quality are not the same measurement; judged only on final loss the depth-and-activation change would look pointless, when in fact it measurably improved mode separation.</w:t>
+        <w:t xml:space="preserve">The third task holds the target fixed and changes only the generator: a two-layer LeakyReLU baseline against a three-layer GELU version on an identical budget. The losses are almost identical (both critic about 1.36 to 1.37, generator about 0.80, modified final critic 1.3671, generator 0.8025). Figure 3 shows that the samples are also broadly similar: both variants reach all nine modes with comparable inter-mode scatter, and the deeper GELU generator is at most marginally cleaner, with slightly less diffuse background noise around the lattice. On a target this simple the extra depth and the change of activation make little visible difference, so here the loss curves and the samples agree that the change is minor; a harder target would be needed to separate the two architectures clearly.</w:t>
       </w:r>
     </w:p>
     <w:p>

</xml_diff>